<commit_message>
Update profile v.099 documents
Co-authored-by: Cursor <cursoragent@cursor.com>
</commit_message>
<xml_diff>
--- a/pdf/장원증_프로필_v.099.docx
+++ b/pdf/장원증_프로필_v.099.docx
@@ -254,10 +254,665 @@
     </w:tbl>
     <w:p/>
     <w:p>
+      <w:pPr>
+        <w:spacing w:after="120"/>
+        <w:rPr>
+          <w:color w:val="4472C4" w:themeColor="accent1"/>
+          <w:u w:val="single"/>
+        </w:rPr>
+      </w:pPr>
+      <w:r>
+        <w:rPr>
+          <w:b/>
+          <w:color w:val="4472C4" w:themeColor="accent1"/>
+          <w:u w:val="single"/>
+        </w:rPr>
+        <w:t>금융 도메인에 특화된 AI/ML 시스템을 직접 설계·구현·운영해온 실전형 AI 엔지니어</w:t>
+      </w:r>
+    </w:p>
+    <w:tbl>
+      <w:tblPr>
+        <w:tblW w:w="0" w:type="auto"/>
+        <w:jc w:val="center"/>
+        <w:tblLook w:val="04A0" w:firstRow="1" w:lastRow="0" w:firstColumn="1" w:lastColumn="0" w:noHBand="0" w:noVBand="1"/>
+      </w:tblPr>
+      <w:tblGrid>
+        <w:gridCol w:w="4879"/>
+        <w:gridCol w:w="4867"/>
+      </w:tblGrid>
+      <w:tr>
+        <w:trPr>
+          <w:jc w:val="center"/>
+        </w:trPr>
+        <w:tc>
+          <w:tcPr>
+            <w:tcW w:w="5100" w:type="dxa"/>
+            <w:shd w:val="clear" w:color="auto" w:fill="F5F5F5"/>
+          </w:tcPr>
+          <w:p>
+            <w:pPr>
+              <w:spacing w:before="120"/>
+              <w:rPr>
+                <w:sz w:val="18"/>
+                <w:szCs w:val="18"/>
+              </w:rPr>
+            </w:pPr>
+            <w:r>
+              <w:rPr>
+                <w:b/>
+                <w:color w:val="0D47A1"/>
+                <w:sz w:val="18"/>
+                <w:szCs w:val="18"/>
+              </w:rPr>
+              <w:t xml:space="preserve">  ◆ LLM &amp; Generative AI</w:t>
+            </w:r>
+          </w:p>
+          <w:p>
+            <w:pPr>
+              <w:ind w:left="170"/>
+              <w:rPr>
+                <w:sz w:val="18"/>
+                <w:szCs w:val="18"/>
+              </w:rPr>
+            </w:pPr>
+            <w:r>
+              <w:rPr>
+                <w:sz w:val="18"/>
+                <w:szCs w:val="18"/>
+              </w:rPr>
+              <w:t xml:space="preserve">  </w:t>
+            </w:r>
+            <w:r>
+              <w:rPr>
+                <w:rFonts w:ascii="Cambria Math" w:hAnsi="Cambria Math" w:cs="Cambria Math"/>
+                <w:sz w:val="18"/>
+                <w:szCs w:val="18"/>
+              </w:rPr>
+              <w:t>▸</w:t>
+            </w:r>
+            <w:r>
+              <w:rPr>
+                <w:sz w:val="18"/>
+                <w:szCs w:val="18"/>
+              </w:rPr>
+              <w:t xml:space="preserve"> Multi-LLM 전략 (Qwen + GPT) 운용</w:t>
+            </w:r>
+            <w:r>
+              <w:rPr>
+                <w:sz w:val="18"/>
+                <w:szCs w:val="18"/>
+              </w:rPr>
+              <w:br/>
+            </w:r>
+            <w:r>
+              <w:rPr>
+                <w:sz w:val="18"/>
+                <w:szCs w:val="18"/>
+              </w:rPr>
+              <w:t xml:space="preserve">  </w:t>
+            </w:r>
+            <w:r>
+              <w:rPr>
+                <w:rFonts w:ascii="Cambria Math" w:hAnsi="Cambria Math" w:cs="Cambria Math"/>
+                <w:sz w:val="18"/>
+                <w:szCs w:val="18"/>
+              </w:rPr>
+              <w:t>▸</w:t>
+            </w:r>
+            <w:r>
+              <w:rPr>
+                <w:sz w:val="18"/>
+                <w:szCs w:val="18"/>
+              </w:rPr>
+              <w:t xml:space="preserve"> RAG : LangChain + Chroma + OpenAI/Llama</w:t>
+            </w:r>
+            <w:r>
+              <w:rPr>
+                <w:sz w:val="18"/>
+                <w:szCs w:val="18"/>
+              </w:rPr>
+              <w:br/>
+            </w:r>
+            <w:r>
+              <w:rPr>
+                <w:sz w:val="18"/>
+                <w:szCs w:val="18"/>
+              </w:rPr>
+              <w:t xml:space="preserve">  </w:t>
+            </w:r>
+            <w:r>
+              <w:rPr>
+                <w:rFonts w:ascii="Cambria Math" w:hAnsi="Cambria Math" w:cs="Cambria Math"/>
+                <w:sz w:val="18"/>
+                <w:szCs w:val="18"/>
+              </w:rPr>
+              <w:t>▸</w:t>
+            </w:r>
+            <w:r>
+              <w:rPr>
+                <w:sz w:val="18"/>
+                <w:szCs w:val="18"/>
+              </w:rPr>
+              <w:t xml:space="preserve"> PEFT 파인튜닝 (LoRA vs QLoRA)</w:t>
+            </w:r>
+            <w:r>
+              <w:rPr>
+                <w:sz w:val="18"/>
+                <w:szCs w:val="18"/>
+              </w:rPr>
+              <w:br/>
+            </w:r>
+            <w:r>
+              <w:rPr>
+                <w:sz w:val="18"/>
+                <w:szCs w:val="18"/>
+              </w:rPr>
+              <w:t xml:space="preserve">  </w:t>
+            </w:r>
+            <w:r>
+              <w:rPr>
+                <w:rFonts w:ascii="Cambria Math" w:hAnsi="Cambria Math" w:cs="Cambria Math"/>
+                <w:sz w:val="18"/>
+                <w:szCs w:val="18"/>
+              </w:rPr>
+              <w:t>▸</w:t>
+            </w:r>
+            <w:r>
+              <w:rPr>
+                <w:sz w:val="18"/>
+                <w:szCs w:val="18"/>
+              </w:rPr>
+              <w:t xml:space="preserve"> Agentic AI / Vibe Coding 실전 적용</w:t>
+            </w:r>
+          </w:p>
+        </w:tc>
+        <w:tc>
+          <w:tcPr>
+            <w:tcW w:w="5100" w:type="dxa"/>
+            <w:shd w:val="clear" w:color="auto" w:fill="F5F5F5"/>
+          </w:tcPr>
+          <w:p>
+            <w:pPr>
+              <w:spacing w:before="120"/>
+              <w:rPr>
+                <w:sz w:val="18"/>
+                <w:szCs w:val="18"/>
+              </w:rPr>
+            </w:pPr>
+            <w:r>
+              <w:rPr>
+                <w:b/>
+                <w:color w:val="0D47A1"/>
+                <w:sz w:val="18"/>
+                <w:szCs w:val="18"/>
+              </w:rPr>
+              <w:t xml:space="preserve">  ◆ ML &amp; Deep Learning</w:t>
+            </w:r>
+          </w:p>
+          <w:p>
+            <w:pPr>
+              <w:ind w:left="170"/>
+              <w:rPr>
+                <w:sz w:val="18"/>
+                <w:szCs w:val="18"/>
+              </w:rPr>
+            </w:pPr>
+            <w:r>
+              <w:rPr>
+                <w:sz w:val="18"/>
+                <w:szCs w:val="18"/>
+              </w:rPr>
+              <w:t xml:space="preserve">  </w:t>
+            </w:r>
+            <w:r>
+              <w:rPr>
+                <w:rFonts w:ascii="Cambria Math" w:hAnsi="Cambria Math" w:cs="Cambria Math"/>
+                <w:sz w:val="18"/>
+                <w:szCs w:val="18"/>
+              </w:rPr>
+              <w:t>▸</w:t>
+            </w:r>
+            <w:r>
+              <w:rPr>
+                <w:sz w:val="18"/>
+                <w:szCs w:val="18"/>
+              </w:rPr>
+              <w:t xml:space="preserve"> Deep Momentum 롤링 강화학습</w:t>
+            </w:r>
+            <w:r>
+              <w:rPr>
+                <w:sz w:val="18"/>
+                <w:szCs w:val="18"/>
+              </w:rPr>
+              <w:br/>
+            </w:r>
+            <w:r>
+              <w:rPr>
+                <w:sz w:val="18"/>
+                <w:szCs w:val="18"/>
+              </w:rPr>
+              <w:t xml:space="preserve">  </w:t>
+            </w:r>
+            <w:r>
+              <w:rPr>
+                <w:rFonts w:ascii="Cambria Math" w:hAnsi="Cambria Math" w:cs="Cambria Math"/>
+                <w:sz w:val="18"/>
+                <w:szCs w:val="18"/>
+              </w:rPr>
+              <w:t>▸</w:t>
+            </w:r>
+            <w:r>
+              <w:rPr>
+                <w:sz w:val="18"/>
+                <w:szCs w:val="18"/>
+              </w:rPr>
+              <w:t xml:space="preserve"> k-means / Contrastive 클러스터링</w:t>
+            </w:r>
+            <w:r>
+              <w:rPr>
+                <w:sz w:val="18"/>
+                <w:szCs w:val="18"/>
+              </w:rPr>
+              <w:br/>
+            </w:r>
+            <w:r>
+              <w:rPr>
+                <w:sz w:val="18"/>
+                <w:szCs w:val="18"/>
+              </w:rPr>
+              <w:t xml:space="preserve">  </w:t>
+            </w:r>
+            <w:r>
+              <w:rPr>
+                <w:rFonts w:ascii="Cambria Math" w:hAnsi="Cambria Math" w:cs="Cambria Math"/>
+                <w:sz w:val="18"/>
+                <w:szCs w:val="18"/>
+              </w:rPr>
+              <w:t>▸</w:t>
+            </w:r>
+            <w:r>
+              <w:rPr>
+                <w:sz w:val="18"/>
+                <w:szCs w:val="18"/>
+              </w:rPr>
+              <w:t xml:space="preserve"> OLS </w:t>
+            </w:r>
+            <w:r>
+              <w:rPr>
+                <w:rFonts w:ascii="맑은 고딕" w:eastAsia="맑은 고딕" w:hAnsi="맑은 고딕" w:cs="맑은 고딕" w:hint="eastAsia"/>
+                <w:sz w:val="18"/>
+                <w:szCs w:val="18"/>
+              </w:rPr>
+              <w:t>→</w:t>
+            </w:r>
+            <w:r>
+              <w:rPr>
+                <w:sz w:val="18"/>
+                <w:szCs w:val="18"/>
+              </w:rPr>
+              <w:t xml:space="preserve"> Random Forest </w:t>
+            </w:r>
+            <w:r>
+              <w:rPr>
+                <w:rFonts w:ascii="맑은 고딕" w:eastAsia="맑은 고딕" w:hAnsi="맑은 고딕" w:cs="맑은 고딕" w:hint="eastAsia"/>
+                <w:sz w:val="18"/>
+                <w:szCs w:val="18"/>
+              </w:rPr>
+              <w:t>→</w:t>
+            </w:r>
+            <w:r>
+              <w:rPr>
+                <w:sz w:val="18"/>
+                <w:szCs w:val="18"/>
+              </w:rPr>
+              <w:t xml:space="preserve"> LSTM 파이프라인</w:t>
+            </w:r>
+            <w:r>
+              <w:rPr>
+                <w:sz w:val="18"/>
+                <w:szCs w:val="18"/>
+              </w:rPr>
+              <w:br/>
+            </w:r>
+            <w:r>
+              <w:rPr>
+                <w:sz w:val="18"/>
+                <w:szCs w:val="18"/>
+              </w:rPr>
+              <w:t xml:space="preserve">  </w:t>
+            </w:r>
+            <w:r>
+              <w:rPr>
+                <w:rFonts w:ascii="Cambria Math" w:hAnsi="Cambria Math" w:cs="Cambria Math"/>
+                <w:sz w:val="18"/>
+                <w:szCs w:val="18"/>
+              </w:rPr>
+              <w:t>▸</w:t>
+            </w:r>
+            <w:r>
+              <w:rPr>
+                <w:sz w:val="18"/>
+                <w:szCs w:val="18"/>
+              </w:rPr>
+              <w:t xml:space="preserve"> KNN 기반 AML 이상거래 탐지</w:t>
+            </w:r>
+          </w:p>
+        </w:tc>
+      </w:tr>
+      <w:tr>
+        <w:trPr>
+          <w:trHeight w:val="537"/>
+          <w:jc w:val="center"/>
+        </w:trPr>
+        <w:tc>
+          <w:tcPr>
+            <w:tcW w:w="5100" w:type="dxa"/>
+            <w:shd w:val="clear" w:color="auto" w:fill="F5F5F5"/>
+          </w:tcPr>
+          <w:p>
+            <w:pPr>
+              <w:spacing w:before="120"/>
+              <w:rPr>
+                <w:sz w:val="18"/>
+                <w:szCs w:val="18"/>
+              </w:rPr>
+            </w:pPr>
+            <w:r>
+              <w:rPr>
+                <w:b/>
+                <w:color w:val="0D47A1"/>
+                <w:sz w:val="18"/>
+                <w:szCs w:val="18"/>
+              </w:rPr>
+              <w:t xml:space="preserve">  ◆ OCR &amp; 문서 자동화</w:t>
+            </w:r>
+          </w:p>
+          <w:p>
+            <w:pPr>
+              <w:ind w:left="170"/>
+              <w:rPr>
+                <w:sz w:val="18"/>
+                <w:szCs w:val="18"/>
+              </w:rPr>
+            </w:pPr>
+            <w:r>
+              <w:rPr>
+                <w:sz w:val="18"/>
+                <w:szCs w:val="18"/>
+              </w:rPr>
+              <w:t xml:space="preserve">  </w:t>
+            </w:r>
+            <w:r>
+              <w:rPr>
+                <w:rFonts w:ascii="Cambria Math" w:hAnsi="Cambria Math" w:cs="Cambria Math"/>
+                <w:sz w:val="18"/>
+                <w:szCs w:val="18"/>
+              </w:rPr>
+              <w:t>▸</w:t>
+            </w:r>
+            <w:r>
+              <w:rPr>
+                <w:sz w:val="18"/>
+                <w:szCs w:val="18"/>
+              </w:rPr>
+              <w:t xml:space="preserve"> Tesseract </w:t>
+            </w:r>
+            <w:r>
+              <w:rPr>
+                <w:rFonts w:ascii="맑은 고딕" w:eastAsia="맑은 고딕" w:hAnsi="맑은 고딕" w:cs="맑은 고딕" w:hint="eastAsia"/>
+                <w:sz w:val="18"/>
+                <w:szCs w:val="18"/>
+              </w:rPr>
+              <w:t>→</w:t>
+            </w:r>
+            <w:r>
+              <w:rPr>
+                <w:sz w:val="18"/>
+                <w:szCs w:val="18"/>
+              </w:rPr>
+              <w:t xml:space="preserve"> Llama3.1 정형화 파이프라인</w:t>
+            </w:r>
+            <w:r>
+              <w:rPr>
+                <w:sz w:val="18"/>
+                <w:szCs w:val="18"/>
+              </w:rPr>
+              <w:br/>
+            </w:r>
+            <w:r>
+              <w:rPr>
+                <w:sz w:val="18"/>
+                <w:szCs w:val="18"/>
+              </w:rPr>
+              <w:t xml:space="preserve">  </w:t>
+            </w:r>
+            <w:r>
+              <w:rPr>
+                <w:rFonts w:ascii="Cambria Math" w:hAnsi="Cambria Math" w:cs="Cambria Math"/>
+                <w:sz w:val="18"/>
+                <w:szCs w:val="18"/>
+              </w:rPr>
+              <w:t>▸</w:t>
+            </w:r>
+            <w:r>
+              <w:rPr>
+                <w:sz w:val="18"/>
+                <w:szCs w:val="18"/>
+              </w:rPr>
+              <w:t xml:space="preserve"> 비정형 공시 → 구조화 JSON 자동 추출</w:t>
+            </w:r>
+            <w:r>
+              <w:rPr>
+                <w:sz w:val="18"/>
+                <w:szCs w:val="18"/>
+              </w:rPr>
+              <w:br/>
+            </w:r>
+            <w:r>
+              <w:rPr>
+                <w:sz w:val="18"/>
+                <w:szCs w:val="18"/>
+              </w:rPr>
+              <w:t xml:space="preserve">  </w:t>
+            </w:r>
+            <w:r>
+              <w:rPr>
+                <w:rFonts w:ascii="Cambria Math" w:hAnsi="Cambria Math" w:cs="Cambria Math"/>
+                <w:sz w:val="18"/>
+                <w:szCs w:val="18"/>
+              </w:rPr>
+              <w:t>▸</w:t>
+            </w:r>
+            <w:r>
+              <w:rPr>
+                <w:sz w:val="18"/>
+                <w:szCs w:val="18"/>
+              </w:rPr>
+              <w:t xml:space="preserve"> 신탁 시스템 실제 운영 탑재</w:t>
+            </w:r>
+          </w:p>
+        </w:tc>
+        <w:tc>
+          <w:tcPr>
+            <w:tcW w:w="5100" w:type="dxa"/>
+            <w:shd w:val="clear" w:color="auto" w:fill="F5F5F5"/>
+          </w:tcPr>
+          <w:p>
+            <w:pPr>
+              <w:spacing w:before="120"/>
+              <w:rPr>
+                <w:sz w:val="18"/>
+                <w:szCs w:val="18"/>
+              </w:rPr>
+            </w:pPr>
+            <w:r>
+              <w:rPr>
+                <w:b/>
+                <w:color w:val="0D47A1"/>
+                <w:sz w:val="18"/>
+                <w:szCs w:val="18"/>
+              </w:rPr>
+              <w:t xml:space="preserve">  ◆ 금융공학 AI 융합</w:t>
+            </w:r>
+          </w:p>
+          <w:p>
+            <w:pPr>
+              <w:ind w:left="170"/>
+              <w:rPr>
+                <w:sz w:val="18"/>
+                <w:szCs w:val="18"/>
+              </w:rPr>
+            </w:pPr>
+            <w:r>
+              <w:rPr>
+                <w:sz w:val="18"/>
+                <w:szCs w:val="18"/>
+              </w:rPr>
+              <w:t xml:space="preserve">  </w:t>
+            </w:r>
+            <w:r>
+              <w:rPr>
+                <w:rFonts w:ascii="Cambria Math" w:hAnsi="Cambria Math" w:cs="Cambria Math"/>
+                <w:sz w:val="18"/>
+                <w:szCs w:val="18"/>
+              </w:rPr>
+              <w:t>▸</w:t>
+            </w:r>
+            <w:r>
+              <w:rPr>
+                <w:sz w:val="18"/>
+                <w:szCs w:val="18"/>
+              </w:rPr>
+              <w:t xml:space="preserve"> MVO / Black-Litterman 자산배분</w:t>
+            </w:r>
+            <w:r>
+              <w:rPr>
+                <w:sz w:val="18"/>
+                <w:szCs w:val="18"/>
+              </w:rPr>
+              <w:br/>
+            </w:r>
+            <w:r>
+              <w:rPr>
+                <w:sz w:val="18"/>
+                <w:szCs w:val="18"/>
+              </w:rPr>
+              <w:t xml:space="preserve">  </w:t>
+            </w:r>
+            <w:r>
+              <w:rPr>
+                <w:rFonts w:ascii="Cambria Math" w:hAnsi="Cambria Math" w:cs="Cambria Math"/>
+                <w:sz w:val="18"/>
+                <w:szCs w:val="18"/>
+              </w:rPr>
+              <w:t>▸</w:t>
+            </w:r>
+            <w:r>
+              <w:rPr>
+                <w:sz w:val="18"/>
+                <w:szCs w:val="18"/>
+              </w:rPr>
+              <w:t xml:space="preserve"> Brinson / Lehmann / Campisi 성과분해</w:t>
+            </w:r>
+            <w:r>
+              <w:rPr>
+                <w:sz w:val="18"/>
+                <w:szCs w:val="18"/>
+              </w:rPr>
+              <w:br/>
+            </w:r>
+            <w:r>
+              <w:rPr>
+                <w:sz w:val="18"/>
+                <w:szCs w:val="18"/>
+              </w:rPr>
+              <w:t xml:space="preserve">  </w:t>
+            </w:r>
+            <w:r>
+              <w:rPr>
+                <w:rFonts w:ascii="Cambria Math" w:hAnsi="Cambria Math" w:cs="Cambria Math"/>
+                <w:sz w:val="18"/>
+                <w:szCs w:val="18"/>
+              </w:rPr>
+              <w:t>▸</w:t>
+            </w:r>
+            <w:r>
+              <w:rPr>
+                <w:sz w:val="18"/>
+                <w:szCs w:val="18"/>
+              </w:rPr>
+              <w:t xml:space="preserve"> Multi-Factor 모델</w:t>
+            </w:r>
+            <w:r>
+              <w:rPr>
+                <w:sz w:val="18"/>
+                <w:szCs w:val="18"/>
+              </w:rPr>
+              <w:br/>
+            </w:r>
+            <w:r>
+              <w:rPr>
+                <w:sz w:val="18"/>
+                <w:szCs w:val="18"/>
+              </w:rPr>
+              <w:t xml:space="preserve">  </w:t>
+            </w:r>
+            <w:r>
+              <w:rPr>
+                <w:rFonts w:ascii="Cambria Math" w:hAnsi="Cambria Math" w:cs="Cambria Math"/>
+                <w:sz w:val="18"/>
+                <w:szCs w:val="18"/>
+              </w:rPr>
+              <w:t>▸</w:t>
+            </w:r>
+            <w:r>
+              <w:rPr>
+                <w:sz w:val="18"/>
+                <w:szCs w:val="18"/>
+              </w:rPr>
+              <w:t xml:space="preserve"> CARINO smoothing / Risk Parity</w:t>
+            </w:r>
+          </w:p>
+        </w:tc>
+      </w:tr>
+    </w:tbl>
+    <w:p/>
+    <w:p>
       <w:r>
         <w:rPr>
           <w:rFonts w:hint="eastAsia"/>
         </w:rPr>
+        <w:t>▶ 프로필 페이지</w:t>
+      </w:r>
+      <w:r>
+        <w:br/>
+      </w:r>
+      <w:hyperlink r:id="rId7" w:history="1">
+        <w:r>
+          <w:rPr>
+            <w:rStyle w:val="a5"/>
+          </w:rPr>
+          <w:t>https://wjjang.streamlit.app/</w:t>
+        </w:r>
+      </w:hyperlink>
+    </w:p>
+    <w:p>
+      <w:pPr>
+        <w:widowControl/>
+        <w:wordWrap/>
+        <w:autoSpaceDE/>
+        <w:autoSpaceDN/>
+      </w:pPr>
+      <w:r>
+        <w:br w:type="page"/>
+      </w:r>
+    </w:p>
+    <w:p>
+      <w:r>
+        <w:rPr>
+          <w:rFonts w:hint="eastAsia"/>
+        </w:rPr>
+        <w:lastRenderedPageBreak/>
         <w:t>▶ 학력사항</w:t>
       </w:r>
     </w:p>
@@ -780,40 +1435,6 @@
       </w:pPr>
     </w:p>
     <w:p>
-      <w:r>
-        <w:rPr>
-          <w:rFonts w:hint="eastAsia"/>
-        </w:rPr>
-        <w:t>▶ 프로필</w:t>
-      </w:r>
-      <w:r>
-        <w:rPr>
-          <w:rFonts w:hint="eastAsia"/>
-        </w:rPr>
-        <w:t xml:space="preserve"> </w:t>
-      </w:r>
-      <w:r>
-        <w:rPr>
-          <w:rFonts w:hint="eastAsia"/>
-        </w:rPr>
-        <w:t>페이지</w:t>
-      </w:r>
-      <w:r>
-        <w:br/>
-      </w:r>
-      <w:hyperlink r:id="rId7" w:history="1">
-        <w:r>
-          <w:rPr>
-            <w:rStyle w:val="a5"/>
-          </w:rPr>
-          <w:t>https://wjjang.streamlit.app/</w:t>
-        </w:r>
-      </w:hyperlink>
-      <w:r>
-        <w:br/>
-      </w:r>
-    </w:p>
-    <w:p>
       <w:pPr>
         <w:widowControl/>
         <w:wordWrap/>
@@ -1179,6 +1800,23 @@
             <w:pPr>
               <w:rPr>
                 <w:rFonts w:eastAsiaTheme="minorHAnsi" w:cs="Arial"/>
+                <w:szCs w:val="20"/>
+                <w:u w:val="single"/>
+              </w:rPr>
+            </w:pPr>
+            <w:r>
+              <w:rPr>
+                <w:rFonts w:eastAsiaTheme="minorHAnsi" w:cs="Arial" w:hint="eastAsia"/>
+                <w:szCs w:val="20"/>
+                <w:u w:val="single"/>
+              </w:rPr>
+              <w:t>Agentic AI, Vibe Coding 기반 업무 혁신</w:t>
+            </w:r>
+          </w:p>
+          <w:p>
+            <w:pPr>
+              <w:rPr>
+                <w:rFonts w:eastAsiaTheme="minorHAnsi" w:cs="Arial" w:hint="eastAsia"/>
                 <w:b/>
                 <w:bCs/>
                 <w:szCs w:val="20"/>
@@ -1191,61 +1829,29 @@
                 <w:bCs/>
                 <w:szCs w:val="20"/>
               </w:rPr>
-              <w:t>1</w:t>
-            </w:r>
-            <w:r>
-              <w:rPr>
-                <w:rFonts w:eastAsiaTheme="minorHAnsi" w:cs="Arial"/>
+              <w:t>1)</w:t>
+            </w:r>
+            <w:r>
+              <w:rPr>
                 <w:b/>
                 <w:bCs/>
-                <w:szCs w:val="20"/>
-              </w:rPr>
-              <w:t xml:space="preserve">) </w:t>
-            </w:r>
-            <w:r>
-              <w:rPr>
-                <w:rFonts w:eastAsiaTheme="minorHAnsi" w:cs="Arial" w:hint="eastAsia"/>
+                <w:sz w:val="19"/>
+              </w:rPr>
+              <w:t xml:space="preserve"> </w:t>
+            </w:r>
+            <w:r>
+              <w:rPr>
                 <w:b/>
                 <w:bCs/>
-                <w:szCs w:val="20"/>
-              </w:rPr>
-              <w:t>공시 데이터 추출</w:t>
-            </w:r>
-          </w:p>
-          <w:p>
-            <w:pPr>
-              <w:rPr>
-                <w:rFonts w:eastAsiaTheme="minorHAnsi" w:cs="Arial"/>
-                <w:szCs w:val="20"/>
-              </w:rPr>
-            </w:pPr>
-            <w:r>
-              <w:rPr>
-                <w:rFonts w:eastAsiaTheme="minorHAnsi" w:cs="Arial" w:hint="eastAsia"/>
-                <w:szCs w:val="20"/>
-              </w:rPr>
-              <w:t>KIND, DAET, SeiBro 데이터 자동 수집하여 LLM으로 구조화 데이터 추출</w:t>
-            </w:r>
-          </w:p>
-          <w:p>
-            <w:pPr>
-              <w:rPr>
-                <w:rFonts w:eastAsiaTheme="minorHAnsi" w:cs="Arial"/>
-                <w:szCs w:val="20"/>
-              </w:rPr>
-            </w:pPr>
-            <w:r>
-              <w:rPr>
-                <w:rFonts w:eastAsiaTheme="minorHAnsi" w:cs="Arial" w:hint="eastAsia"/>
-                <w:szCs w:val="20"/>
-              </w:rPr>
-              <w:t>비정형 공시 데이터에서 구조화 JSON 추출하기 위해 Multi-LLM 전략운용</w:t>
-            </w:r>
-          </w:p>
-          <w:p>
-            <w:pPr>
-              <w:rPr>
-                <w:rFonts w:eastAsiaTheme="minorHAnsi" w:cs="Arial" w:hint="eastAsia"/>
+                <w:sz w:val="19"/>
+              </w:rPr>
+              <w:t>자본시장DB 데이터 사업, 레포트/컨센서스 수집, 인사이트 도출</w:t>
+            </w:r>
+          </w:p>
+          <w:p>
+            <w:pPr>
+              <w:rPr>
+                <w:rFonts w:eastAsiaTheme="minorHAnsi" w:cs="Arial"/>
                 <w:b/>
                 <w:bCs/>
                 <w:szCs w:val="20"/>
@@ -1258,18 +1864,17 @@
                 <w:bCs/>
                 <w:szCs w:val="20"/>
               </w:rPr>
-              <w:t>2) 산업분류 클러스터링</w:t>
-            </w:r>
-          </w:p>
-          <w:p>
-            <w:pPr>
+              <w:t>2</w:t>
+            </w:r>
+            <w:r>
               <w:rPr>
                 <w:rFonts w:eastAsiaTheme="minorHAnsi" w:cs="Arial"/>
                 <w:b/>
                 <w:bCs/>
                 <w:szCs w:val="20"/>
               </w:rPr>
-            </w:pPr>
+              <w:t xml:space="preserve">) </w:t>
+            </w:r>
             <w:r>
               <w:rPr>
                 <w:rFonts w:eastAsiaTheme="minorHAnsi" w:cs="Arial" w:hint="eastAsia"/>
@@ -1277,17 +1882,48 @@
                 <w:bCs/>
                 <w:szCs w:val="20"/>
               </w:rPr>
-              <w:t>3</w:t>
-            </w:r>
-            <w:r>
+              <w:t>공시 데이터 추출</w:t>
+            </w:r>
+          </w:p>
+          <w:p>
+            <w:pPr>
+              <w:rPr>
+                <w:rFonts w:eastAsiaTheme="minorHAnsi" w:cs="Arial"/>
+                <w:szCs w:val="20"/>
+              </w:rPr>
+            </w:pPr>
+            <w:r>
+              <w:rPr>
+                <w:rFonts w:eastAsiaTheme="minorHAnsi" w:cs="Arial" w:hint="eastAsia"/>
+                <w:szCs w:val="20"/>
+              </w:rPr>
+              <w:t>KIND, DAET, SeiBro 데이터 자동 수집하여 LLM으로 구조화 데이터 추출</w:t>
+            </w:r>
+          </w:p>
+          <w:p>
+            <w:pPr>
+              <w:rPr>
+                <w:rFonts w:eastAsiaTheme="minorHAnsi" w:cs="Arial"/>
+                <w:szCs w:val="20"/>
+              </w:rPr>
+            </w:pPr>
+            <w:r>
+              <w:rPr>
+                <w:rFonts w:eastAsiaTheme="minorHAnsi" w:cs="Arial" w:hint="eastAsia"/>
+                <w:szCs w:val="20"/>
+              </w:rPr>
+              <w:t>비정형 공시 데이터에서 구조화 JSON 추출하기 위해 Multi-LLM 전략운용</w:t>
+            </w:r>
+          </w:p>
+          <w:p>
+            <w:pPr>
               <w:rPr>
                 <w:rFonts w:eastAsiaTheme="minorHAnsi" w:cs="Arial"/>
                 <w:b/>
                 <w:bCs/>
                 <w:szCs w:val="20"/>
               </w:rPr>
-              <w:t xml:space="preserve">) </w:t>
-            </w:r>
+            </w:pPr>
             <w:r>
               <w:rPr>
                 <w:rFonts w:eastAsiaTheme="minorHAnsi" w:cs="Arial" w:hint="eastAsia"/>
@@ -1295,6 +1931,52 @@
                 <w:bCs/>
                 <w:szCs w:val="20"/>
               </w:rPr>
+              <w:t>3</w:t>
+            </w:r>
+            <w:r>
+              <w:rPr>
+                <w:rFonts w:eastAsiaTheme="minorHAnsi" w:cs="Arial" w:hint="eastAsia"/>
+                <w:b/>
+                <w:bCs/>
+                <w:szCs w:val="20"/>
+              </w:rPr>
+              <w:t>) 산업분류 클러스터링</w:t>
+            </w:r>
+          </w:p>
+          <w:p>
+            <w:pPr>
+              <w:rPr>
+                <w:rFonts w:eastAsiaTheme="minorHAnsi" w:cs="Arial"/>
+                <w:b/>
+                <w:bCs/>
+                <w:szCs w:val="20"/>
+              </w:rPr>
+            </w:pPr>
+            <w:r>
+              <w:rPr>
+                <w:rFonts w:eastAsiaTheme="minorHAnsi" w:cs="Arial" w:hint="eastAsia"/>
+                <w:b/>
+                <w:bCs/>
+                <w:szCs w:val="20"/>
+              </w:rPr>
+              <w:t>4</w:t>
+            </w:r>
+            <w:r>
+              <w:rPr>
+                <w:rFonts w:eastAsiaTheme="minorHAnsi" w:cs="Arial"/>
+                <w:b/>
+                <w:bCs/>
+                <w:szCs w:val="20"/>
+              </w:rPr>
+              <w:t xml:space="preserve">) </w:t>
+            </w:r>
+            <w:r>
+              <w:rPr>
+                <w:rFonts w:eastAsiaTheme="minorHAnsi" w:cs="Arial" w:hint="eastAsia"/>
+                <w:b/>
+                <w:bCs/>
+                <w:szCs w:val="20"/>
+              </w:rPr>
               <w:t>인덱스 엔진 개발</w:t>
             </w:r>
           </w:p>
@@ -1316,16 +1998,65 @@
           <w:p>
             <w:pPr>
               <w:rPr>
-                <w:rFonts w:eastAsiaTheme="minorHAnsi" w:cs="Arial" w:hint="eastAsia"/>
-                <w:szCs w:val="20"/>
-              </w:rPr>
-            </w:pPr>
-            <w:r>
-              <w:rPr>
-                <w:rFonts w:eastAsiaTheme="minorHAnsi" w:cs="Arial" w:hint="eastAsia"/>
-                <w:szCs w:val="20"/>
-              </w:rPr>
-              <w:t>LLM을 통한 테마 추출하여 테마액티스인덱스 개발</w:t>
+                <w:rFonts w:eastAsiaTheme="minorHAnsi" w:cs="Arial"/>
+                <w:szCs w:val="20"/>
+              </w:rPr>
+            </w:pPr>
+            <w:r>
+              <w:rPr>
+                <w:rFonts w:eastAsiaTheme="minorHAnsi" w:cs="Arial" w:hint="eastAsia"/>
+                <w:szCs w:val="20"/>
+              </w:rPr>
+              <w:t>LLM</w:t>
+            </w:r>
+            <w:r>
+              <w:rPr>
+                <w:rFonts w:eastAsiaTheme="minorHAnsi" w:cs="Arial" w:hint="eastAsia"/>
+                <w:szCs w:val="20"/>
+              </w:rPr>
+              <w:t xml:space="preserve"> 기반</w:t>
+            </w:r>
+            <w:r>
+              <w:rPr>
+                <w:rFonts w:eastAsiaTheme="minorHAnsi" w:cs="Arial" w:hint="eastAsia"/>
+                <w:szCs w:val="20"/>
+              </w:rPr>
+              <w:t xml:space="preserve"> 테마 추출하여 테마</w:t>
+            </w:r>
+            <w:r>
+              <w:rPr>
+                <w:rFonts w:eastAsiaTheme="minorHAnsi" w:cs="Arial" w:hint="eastAsia"/>
+                <w:szCs w:val="20"/>
+              </w:rPr>
+              <w:t xml:space="preserve"> </w:t>
+            </w:r>
+            <w:r>
+              <w:rPr>
+                <w:rFonts w:eastAsiaTheme="minorHAnsi" w:cs="Arial" w:hint="eastAsia"/>
+                <w:szCs w:val="20"/>
+              </w:rPr>
+              <w:t>액티스</w:t>
+            </w:r>
+            <w:r>
+              <w:rPr>
+                <w:rFonts w:eastAsiaTheme="minorHAnsi" w:cs="Arial" w:hint="eastAsia"/>
+                <w:szCs w:val="20"/>
+              </w:rPr>
+              <w:t xml:space="preserve"> </w:t>
+            </w:r>
+            <w:r>
+              <w:rPr>
+                <w:rFonts w:eastAsiaTheme="minorHAnsi" w:cs="Arial" w:hint="eastAsia"/>
+                <w:szCs w:val="20"/>
+              </w:rPr>
+              <w:t xml:space="preserve">인덱스 </w:t>
+            </w:r>
+            <w:r>
+              <w:rPr>
+                <w:rFonts w:eastAsiaTheme="minorHAnsi" w:cs="Arial" w:hint="eastAsia"/>
+                <w:szCs w:val="20"/>
+              </w:rPr>
+              <w:t>기획</w:t>
             </w:r>
           </w:p>
         </w:tc>
@@ -1776,7 +2507,6 @@
                 <w:color w:val="31333F"/>
                 <w:shd w:val="clear" w:color="auto" w:fill="FFFFFF"/>
               </w:rPr>
-              <w:lastRenderedPageBreak/>
               <w:t>검수</w:t>
             </w:r>
             <w:r>
@@ -2345,7 +3075,6 @@
                 <w:rFonts w:eastAsiaTheme="minorHAnsi" w:cs="Arial"/>
                 <w:szCs w:val="20"/>
               </w:rPr>
-              <w:lastRenderedPageBreak/>
               <w:t>회사명</w:t>
             </w:r>
           </w:p>
@@ -2538,6 +3267,7 @@
                 <w:rFonts w:eastAsiaTheme="minorHAnsi" w:cs="Arial"/>
                 <w:szCs w:val="20"/>
               </w:rPr>
+              <w:lastRenderedPageBreak/>
               <w:t>업무기간</w:t>
             </w:r>
           </w:p>
@@ -3553,7 +4283,6 @@
                 <w:rFonts w:eastAsiaTheme="minorHAnsi" w:cs="Arial"/>
                 <w:szCs w:val="20"/>
               </w:rPr>
-              <w:lastRenderedPageBreak/>
               <w:t>수탁데이터 피딩 배치에서부터 데일리/집계/지표 산출 배치가 주 담당</w:t>
             </w:r>
           </w:p>
@@ -3741,6 +4470,7 @@
                 <w:rFonts w:eastAsiaTheme="minorHAnsi" w:cs="Arial"/>
                 <w:szCs w:val="20"/>
               </w:rPr>
+              <w:lastRenderedPageBreak/>
               <w:t>화면 개발 일부 참여 및 화면개발 담당자 쿼리 지원</w:t>
             </w:r>
           </w:p>
@@ -5019,7 +5749,6 @@
                 <w:rFonts w:eastAsiaTheme="minorHAnsi" w:cs="Arial"/>
                 <w:szCs w:val="20"/>
               </w:rPr>
-              <w:lastRenderedPageBreak/>
               <w:t>* 리스크배분(budgeting)</w:t>
             </w:r>
           </w:p>
@@ -5137,6 +5866,7 @@
                 <w:rFonts w:eastAsiaTheme="minorHAnsi" w:cs="Arial"/>
                 <w:szCs w:val="20"/>
               </w:rPr>
+              <w:lastRenderedPageBreak/>
               <w:t>- Nexacro, JAVA, Oracle</w:t>
             </w:r>
           </w:p>
@@ -6467,7 +7197,6 @@
                 <w:rFonts w:eastAsiaTheme="minorHAnsi" w:cs="Arial" w:hint="eastAsia"/>
                 <w:szCs w:val="20"/>
               </w:rPr>
-              <w:lastRenderedPageBreak/>
               <w:t>2</w:t>
             </w:r>
             <w:r>
@@ -6851,6 +7580,7 @@
               <w:rPr>
                 <w:rFonts w:hint="eastAsia"/>
               </w:rPr>
+              <w:lastRenderedPageBreak/>
               <w:t>레버리지 ETP, ETF, ETN</w:t>
             </w:r>
           </w:p>

</xml_diff>